<commit_message>
ENT-3.1 : trame Word/PDF et corrigé régénérés pour la carte réelle (nouvelles rues, quartiers, cases, km, départ 14 h 00)
Co-Authored-By: Claude Sonnet 5.5 <noreply@anthropic.com>
</commit_message>
<xml_diff>
--- a/contenus/trames/ENT-3.1-boost-tournee-trame-eleve.docx
+++ b/contenus/trames/ENT-3.1-boost-tournee-trame-eleve.docx
@@ -1717,7 +1717,7 @@
           <w:color w:val="1A1A1A"/>
           <w:sz w:val="19"/>
         </w:rPr>
-        <w:t>Dans la liste des commandes, une ligne donne : le nom du commerce, sa rue, le nombre de colis et le poids. Les clients ne donnent que le nom de leur rue : pas de quartier, pas de plan.</w:t>
+        <w:t>Dans la liste des commandes, une ligne donne : le nom du commerce, sa rue, le nombre de colis et le poids. Les clients ne donnent que le nom de leur rue : pas de quartier, pas de case.</w:t>
       </w:r>
     </w:p>
     <w:p>
@@ -1929,7 +1929,7 @@
           <w:color w:val="1A1A1A"/>
           <w:sz w:val="22"/>
         </w:rPr>
-        <w:t>Dans le menu de gauche, clique sur « Plan de Nîmes ». Tu vois un plan dessiné, avec un quadrillage : des colonnes A à F et des lignes 1 à 4. Une case s'écrit lettre puis chiffre, par exemple C2. Les clients n'y sont pas encore nommés : à toi de les situer.</w:t>
+        <w:t>Dans le menu de gauche, clique sur « Plan de Nîmes ». Tu vois la vraie carte de la ville, avec un quadrillage : des colonnes A à E et des lignes 1 à 5 (une case fait 1 km de côté). Une case s'écrit lettre puis chiffre, par exemple C2. Les sept quartiers sont dessinés avec leur nom, et les sept clients sont des points numérotés : le numéro est celui de la fiche de M. Morin. Leurs noms ne sont pas encore écrits sur la carte.</w:t>
       </w:r>
     </w:p>
     <w:p>
@@ -1950,7 +1950,7 @@
         <w:rPr>
           <w:sz w:val="22"/>
         </w:rPr>
-        <w:t>Clique sur « Ouvrir un plan de Nîmes (OpenStreetMap) » : un plan en ligne s'ouvre dans un autre onglet.</w:t>
+        <w:t>Sous la carte, le tableau a une ligne par client, avec le numéro et la rue. Clique sur une ligne : son point s'entoure sur la carte (et l'inverse marche aussi : clique sur un point).</w:t>
       </w:r>
     </w:p>
     <w:p>
@@ -1971,7 +1971,7 @@
         <w:rPr>
           <w:sz w:val="22"/>
         </w:rPr>
-        <w:t>Dans ce plan, cherche chaque rue du tableau ci-dessous (écris le nom de la rue puis « Nîmes »).</w:t>
+        <w:t>Lis la case du point : la lettre de la colonne, puis le chiffre de la ligne.</w:t>
       </w:r>
     </w:p>
     <w:p>
@@ -1992,7 +1992,7 @@
         <w:rPr>
           <w:sz w:val="22"/>
         </w:rPr>
-        <w:t>Repère où se trouve la rue par rapport au centre-ville, aux Arènes et à la gare.</w:t>
+        <w:t>Lis le nom du quartier dessiné autour du point. Pour vérifier la rue, clique sur le quartier : la carte zoome et écrit les noms de rues.</w:t>
       </w:r>
     </w:p>
     <w:p>
@@ -2013,28 +2013,7 @@
         <w:rPr>
           <w:sz w:val="22"/>
         </w:rPr>
-        <w:t>Reviens sur le plan dessiné, trouve le point qui correspond, et note sa case dans le tableau.</w:t>
-      </w:r>
-    </w:p>
-    <w:p>
-      <w:pPr>
-        <w:keepNext/>
-        <w:spacing w:after="80"/>
-        <w:ind w:left="454" w:hanging="454"/>
-      </w:pPr>
-      <w:r>
-        <w:rPr>
-          <w:b/>
-          <w:color w:val="111111"/>
-          <w:sz w:val="22"/>
-        </w:rPr>
-        <w:t xml:space="preserve">5.  </w:t>
-      </w:r>
-      <w:r>
-        <w:rPr>
-          <w:sz w:val="22"/>
-        </w:rPr>
-        <w:t>Note aussi le quartier de la rue : le plan en ligne l'écrit, ou le plan dessiné l'écrit à côté du point.</w:t>
+        <w:t>Écris ta réponse dans le tableau ci-dessous, puis dans la ligne du logiciel : la case à taper, le quartier à choisir dans le menu déroulant.</w:t>
       </w:r>
     </w:p>
     <w:tbl>
@@ -2045,15 +2024,15 @@
         <w:tblLook w:firstColumn="1" w:firstRow="1" w:lastColumn="0" w:lastRow="0" w:noHBand="0" w:noVBand="1" w:val="04A0"/>
       </w:tblPr>
       <w:tblGrid>
-        <w:gridCol w:w="2608"/>
-        <w:gridCol w:w="2948"/>
-        <w:gridCol w:w="1247"/>
-        <w:gridCol w:w="2835"/>
+        <w:gridCol w:w="794"/>
+        <w:gridCol w:w="3515"/>
+        <w:gridCol w:w="3288"/>
+        <w:gridCol w:w="2041"/>
       </w:tblGrid>
       <w:tr>
         <w:tc>
           <w:tcPr>
-            <w:tcW w:type="dxa" w:w="2608"/>
+            <w:tcW w:type="dxa" w:w="794"/>
             <w:shd w:fill="E8E8E8"/>
           </w:tcPr>
           <w:p>
@@ -2067,13 +2046,13 @@
                 <w:color w:val="111111"/>
                 <w:sz w:val="20"/>
               </w:rPr>
-              <w:t>Client</w:t>
+              <w:t>N°</w:t>
             </w:r>
           </w:p>
         </w:tc>
         <w:tc>
           <w:tcPr>
-            <w:tcW w:type="dxa" w:w="2948"/>
+            <w:tcW w:type="dxa" w:w="3515"/>
             <w:shd w:fill="E8E8E8"/>
           </w:tcPr>
           <w:p>
@@ -2093,7 +2072,27 @@
         </w:tc>
         <w:tc>
           <w:tcPr>
-            <w:tcW w:type="dxa" w:w="1247"/>
+            <w:tcW w:type="dxa" w:w="3288"/>
+            <w:shd w:fill="E8E8E8"/>
+          </w:tcPr>
+          <w:p>
+            <w:pPr>
+              <w:keepNext/>
+              <w:spacing w:after="0"/>
+            </w:pPr>
+            <w:r>
+              <w:rPr>
+                <w:b/>
+                <w:color w:val="111111"/>
+                <w:sz w:val="20"/>
+              </w:rPr>
+              <w:t>Quartier</w:t>
+            </w:r>
+          </w:p>
+        </w:tc>
+        <w:tc>
+          <w:tcPr>
+            <w:tcW w:type="dxa" w:w="2041"/>
             <w:shd w:fill="E8E8E8"/>
           </w:tcPr>
           <w:p>
@@ -2111,26 +2110,6 @@
             </w:r>
           </w:p>
         </w:tc>
-        <w:tc>
-          <w:tcPr>
-            <w:tcW w:type="dxa" w:w="2835"/>
-            <w:shd w:fill="E8E8E8"/>
-          </w:tcPr>
-          <w:p>
-            <w:pPr>
-              <w:keepNext/>
-              <w:spacing w:after="0"/>
-            </w:pPr>
-            <w:r>
-              <w:rPr>
-                <w:b/>
-                <w:color w:val="111111"/>
-                <w:sz w:val="20"/>
-              </w:rPr>
-              <w:t>Quartier</w:t>
-            </w:r>
-          </w:p>
-        </w:tc>
       </w:tr>
       <w:tr>
         <w:trPr>
@@ -2138,7 +2117,7 @@
         </w:trPr>
         <w:tc>
           <w:tcPr>
-            <w:tcW w:type="dxa" w:w="2608"/>
+            <w:tcW w:type="dxa" w:w="794"/>
           </w:tcPr>
           <w:p>
             <w:pPr>
@@ -2148,13 +2127,13 @@
               <w:rPr>
                 <w:sz w:val="20"/>
               </w:rPr>
-              <w:t>Le Comptoir des Halles</w:t>
+              <w:t>1</w:t>
             </w:r>
           </w:p>
         </w:tc>
         <w:tc>
           <w:tcPr>
-            <w:tcW w:type="dxa" w:w="2948"/>
+            <w:tcW w:type="dxa" w:w="3515"/>
           </w:tcPr>
           <w:p>
             <w:pPr>
@@ -2164,19 +2143,19 @@
               <w:rPr>
                 <w:sz w:val="20"/>
               </w:rPr>
-              <w:t>rue Général Perrier</w:t>
+              <w:t>rue du Général Perrier</w:t>
             </w:r>
           </w:p>
         </w:tc>
         <w:tc>
           <w:tcPr>
-            <w:tcW w:type="dxa" w:w="1247"/>
+            <w:tcW w:type="dxa" w:w="3288"/>
           </w:tcPr>
           <w:p/>
         </w:tc>
         <w:tc>
           <w:tcPr>
-            <w:tcW w:type="dxa" w:w="2835"/>
+            <w:tcW w:type="dxa" w:w="2041"/>
           </w:tcPr>
           <w:p/>
         </w:tc>
@@ -2187,7 +2166,7 @@
         </w:trPr>
         <w:tc>
           <w:tcPr>
-            <w:tcW w:type="dxa" w:w="2608"/>
+            <w:tcW w:type="dxa" w:w="794"/>
           </w:tcPr>
           <w:p>
             <w:pPr>
@@ -2197,13 +2176,13 @@
               <w:rPr>
                 <w:sz w:val="20"/>
               </w:rPr>
-              <w:t>Épicerie Verdier</w:t>
+              <w:t>2</w:t>
             </w:r>
           </w:p>
         </w:tc>
         <w:tc>
           <w:tcPr>
-            <w:tcW w:type="dxa" w:w="2948"/>
+            <w:tcW w:type="dxa" w:w="3515"/>
           </w:tcPr>
           <w:p>
             <w:pPr>
@@ -2213,19 +2192,19 @@
               <w:rPr>
                 <w:sz w:val="20"/>
               </w:rPr>
-              <w:t>quai de la Fontaine</w:t>
+              <w:t>rue de Combret</w:t>
             </w:r>
           </w:p>
         </w:tc>
         <w:tc>
           <w:tcPr>
-            <w:tcW w:type="dxa" w:w="1247"/>
+            <w:tcW w:type="dxa" w:w="3288"/>
           </w:tcPr>
           <w:p/>
         </w:tc>
         <w:tc>
           <w:tcPr>
-            <w:tcW w:type="dxa" w:w="2835"/>
+            <w:tcW w:type="dxa" w:w="2041"/>
           </w:tcPr>
           <w:p/>
         </w:tc>
@@ -2236,7 +2215,7 @@
         </w:trPr>
         <w:tc>
           <w:tcPr>
-            <w:tcW w:type="dxa" w:w="2608"/>
+            <w:tcW w:type="dxa" w:w="794"/>
           </w:tcPr>
           <w:p>
             <w:pPr>
@@ -2246,13 +2225,13 @@
               <w:rPr>
                 <w:sz w:val="20"/>
               </w:rPr>
-              <w:t>La Pointe Sud</w:t>
+              <w:t>3</w:t>
             </w:r>
           </w:p>
         </w:tc>
         <w:tc>
           <w:tcPr>
-            <w:tcW w:type="dxa" w:w="2948"/>
+            <w:tcW w:type="dxa" w:w="3515"/>
           </w:tcPr>
           <w:p>
             <w:pPr>
@@ -2268,13 +2247,13 @@
         </w:tc>
         <w:tc>
           <w:tcPr>
-            <w:tcW w:type="dxa" w:w="1247"/>
+            <w:tcW w:type="dxa" w:w="3288"/>
           </w:tcPr>
           <w:p/>
         </w:tc>
         <w:tc>
           <w:tcPr>
-            <w:tcW w:type="dxa" w:w="2835"/>
+            <w:tcW w:type="dxa" w:w="2041"/>
           </w:tcPr>
           <w:p/>
         </w:tc>
@@ -2285,7 +2264,7 @@
         </w:trPr>
         <w:tc>
           <w:tcPr>
-            <w:tcW w:type="dxa" w:w="2608"/>
+            <w:tcW w:type="dxa" w:w="794"/>
           </w:tcPr>
           <w:p>
             <w:pPr>
@@ -2295,13 +2274,13 @@
               <w:rPr>
                 <w:sz w:val="20"/>
               </w:rPr>
-              <w:t>Maison Lauze</w:t>
+              <w:t>4</w:t>
             </w:r>
           </w:p>
         </w:tc>
         <w:tc>
           <w:tcPr>
-            <w:tcW w:type="dxa" w:w="2948"/>
+            <w:tcW w:type="dxa" w:w="3515"/>
           </w:tcPr>
           <w:p>
             <w:pPr>
@@ -2317,13 +2296,13 @@
         </w:tc>
         <w:tc>
           <w:tcPr>
-            <w:tcW w:type="dxa" w:w="1247"/>
+            <w:tcW w:type="dxa" w:w="3288"/>
           </w:tcPr>
           <w:p/>
         </w:tc>
         <w:tc>
           <w:tcPr>
-            <w:tcW w:type="dxa" w:w="2835"/>
+            <w:tcW w:type="dxa" w:w="2041"/>
           </w:tcPr>
           <w:p/>
         </w:tc>
@@ -2334,7 +2313,7 @@
         </w:trPr>
         <w:tc>
           <w:tcPr>
-            <w:tcW w:type="dxa" w:w="2608"/>
+            <w:tcW w:type="dxa" w:w="794"/>
           </w:tcPr>
           <w:p>
             <w:pPr>
@@ -2344,13 +2323,13 @@
               <w:rPr>
                 <w:sz w:val="20"/>
               </w:rPr>
-              <w:t>Studio Garance</w:t>
+              <w:t>5</w:t>
             </w:r>
           </w:p>
         </w:tc>
         <w:tc>
           <w:tcPr>
-            <w:tcW w:type="dxa" w:w="2948"/>
+            <w:tcW w:type="dxa" w:w="3515"/>
           </w:tcPr>
           <w:p>
             <w:pPr>
@@ -2360,19 +2339,19 @@
               <w:rPr>
                 <w:sz w:val="20"/>
               </w:rPr>
-              <w:t>route de Courbessac</w:t>
+              <w:t>rue Edmond Rostand</w:t>
             </w:r>
           </w:p>
         </w:tc>
         <w:tc>
           <w:tcPr>
-            <w:tcW w:type="dxa" w:w="1247"/>
+            <w:tcW w:type="dxa" w:w="3288"/>
           </w:tcPr>
           <w:p/>
         </w:tc>
         <w:tc>
           <w:tcPr>
-            <w:tcW w:type="dxa" w:w="2835"/>
+            <w:tcW w:type="dxa" w:w="2041"/>
           </w:tcPr>
           <w:p/>
         </w:tc>
@@ -2383,7 +2362,7 @@
         </w:trPr>
         <w:tc>
           <w:tcPr>
-            <w:tcW w:type="dxa" w:w="2608"/>
+            <w:tcW w:type="dxa" w:w="794"/>
           </w:tcPr>
           <w:p>
             <w:pPr>
@@ -2393,13 +2372,13 @@
               <w:rPr>
                 <w:sz w:val="20"/>
               </w:rPr>
-              <w:t>Atelier Mazet</w:t>
+              <w:t>6</w:t>
             </w:r>
           </w:p>
         </w:tc>
         <w:tc>
           <w:tcPr>
-            <w:tcW w:type="dxa" w:w="2948"/>
+            <w:tcW w:type="dxa" w:w="3515"/>
           </w:tcPr>
           <w:p>
             <w:pPr>
@@ -2409,19 +2388,19 @@
               <w:rPr>
                 <w:sz w:val="20"/>
               </w:rPr>
-              <w:t>rue de Grézan</w:t>
+              <w:t>rue Graverol</w:t>
             </w:r>
           </w:p>
         </w:tc>
         <w:tc>
           <w:tcPr>
-            <w:tcW w:type="dxa" w:w="1247"/>
+            <w:tcW w:type="dxa" w:w="3288"/>
           </w:tcPr>
           <w:p/>
         </w:tc>
         <w:tc>
           <w:tcPr>
-            <w:tcW w:type="dxa" w:w="2835"/>
+            <w:tcW w:type="dxa" w:w="2041"/>
           </w:tcPr>
           <w:p/>
         </w:tc>
@@ -2432,7 +2411,7 @@
         </w:trPr>
         <w:tc>
           <w:tcPr>
-            <w:tcW w:type="dxa" w:w="2608"/>
+            <w:tcW w:type="dxa" w:w="794"/>
           </w:tcPr>
           <w:p>
             <w:pPr>
@@ -2442,13 +2421,13 @@
               <w:rPr>
                 <w:sz w:val="20"/>
               </w:rPr>
-              <w:t>Caveau Pélissier</w:t>
+              <w:t>7</w:t>
             </w:r>
           </w:p>
         </w:tc>
         <w:tc>
           <w:tcPr>
-            <w:tcW w:type="dxa" w:w="2948"/>
+            <w:tcW w:type="dxa" w:w="3515"/>
           </w:tcPr>
           <w:p>
             <w:pPr>
@@ -2458,19 +2437,19 @@
               <w:rPr>
                 <w:sz w:val="20"/>
               </w:rPr>
-              <w:t>avenue de la Bouvine</w:t>
+              <w:t>rue Roger Sabatier</w:t>
             </w:r>
           </w:p>
         </w:tc>
         <w:tc>
           <w:tcPr>
-            <w:tcW w:type="dxa" w:w="1247"/>
+            <w:tcW w:type="dxa" w:w="3288"/>
           </w:tcPr>
           <w:p/>
         </w:tc>
         <w:tc>
           <w:tcPr>
-            <w:tcW w:type="dxa" w:w="2835"/>
+            <w:tcW w:type="dxa" w:w="2041"/>
           </w:tcPr>
           <w:p/>
         </w:tc>
@@ -2514,7 +2493,7 @@
               <w:rPr>
                 <w:sz w:val="20"/>
               </w:rPr>
-              <w:t>ce plan est un schéma, pas une carte à l'échelle : le centre est dessiné plus grand qu'en vrai, donc tu ne retrouveras pas les mêmes distances sur le plan en ligne. Cherche l'orientation (la flèche du nord) et les grands repères. Si un point touche une ligne du quadrillage, essaie les deux cases voisines.</w:t>
+              <w:t>le menu des quartiers propose douze noms pour sept clients : cinq ne sont à personne, donc tu ne peux pas finir par élimination. Si tu hésites entre deux cases, choisis celle où se trouve le centre du point : le logiciel accepte une seule case fausse.</w:t>
             </w:r>
           </w:p>
         </w:tc>
@@ -2537,7 +2516,7 @@
           <w:color w:val="1A1A1A"/>
           <w:sz w:val="22"/>
         </w:rPr>
-        <w:t>Recopie maintenant ces informations sur le plan dessiné, dans les lignes prévues (une case et un quartier choisi dans le menu déroulant, pour chaque client). Puis clique sur « Valider le repérage ».</w:t>
+        <w:t>Clique maintenant sur « Valider le repérage ».</w:t>
       </w:r>
     </w:p>
     <w:tbl>
@@ -2572,7 +2551,7 @@
               <w:rPr>
                 <w:sz w:val="20"/>
               </w:rPr>
-              <w:t>un champ qui devient rouge quand la case ou le quartier est faux ; le message « Repérage validé » quand tout est bon ; les sept noms qui s'écrivent sur le plan ; et une nouvelle entrée dans le menu de gauche, « Tournée du 14 avril ». Le logiciel accepte une erreur, mais le point du suivi n'est donné que si les sept clients sont justes. Après trois essais ratés, un bouton « Je ne trouve pas, continuer quand même » apparaît : tu peux avancer, mais ton suivi le montre. Le « Mode hors connexion » (en haut) donne les quartiers sans les cases ; son usage est lui aussi noté dans le suivi.</w:t>
+              <w:t>un champ qui devient rouge quand la case ou le quartier est faux ; le message « Repérage validé » quand tout est bon ; les sept noms de clients qui s'écrivent dans le tableau ; et une nouvelle entrée dans le menu de gauche, « Tournée du 14 avril ». Le logiciel accepte une erreur, mais le point du suivi n'est donné que si les sept clients sont justes. Après trois essais ratés, un bouton « Je ne trouve pas, continuer quand même » apparaît : tu peux avancer, mais ton suivi le montre. Le « Mode hors connexion » (en haut) remplit les quartiers à ta place, sans les cases ; son usage est lui aussi noté dans le suivi.</w:t>
             </w:r>
           </w:p>
         </w:tc>
@@ -2632,7 +2611,7 @@
                 <w:b/>
                 <w:sz w:val="21"/>
               </w:rPr>
-              <w:t>Pour l'adresse la plus difficile, comment as-tu trouvé la case ?</w:t>
+              <w:t>Pour le client le plus difficile à situer, comment as-tu trouvé la case et le quartier ?</w:t>
             </w:r>
           </w:p>
           <w:p>
@@ -4170,7 +4149,7 @@
         <w:rPr>
           <w:sz w:val="22"/>
         </w:rPr>
-        <w:t>Heure de départ : tape simplement 13:00 (pas de formule).</w:t>
+        <w:t>Heure de départ : tape simplement 14:00 (pas de formule).</w:t>
       </w:r>
     </w:p>
     <w:p>
@@ -4247,7 +4226,7 @@
               <w:rPr>
                 <w:sz w:val="20"/>
               </w:rPr>
-              <w:t>le logiciel compte les heures en minutes depuis minuit : 13 h 00, c'est 13 × 60 = 780 minutes. C'est ce qui te permet d'ajouter une heure et des minutes. Ne tape pas « 13 » tout seul : écris 13:00 ou 13h00. Un exemple pour comprendre l'étape 1 : 6 km à 12 km/h, c'est 6 ÷ 12 = 0,5 h.</w:t>
+              <w:t>le logiciel compte les heures en minutes depuis minuit : 14 h 00, c'est 14 × 60 = 840 minutes. C'est ce qui te permet d'ajouter une heure et des minutes. Ne tape pas « 14 » tout seul : écris 14:00 ou 14h00. Un exemple pour comprendre l'étape 1 : 6 km à 12 km/h, c'est 6 ÷ 12 = 0,5 h.</w:t>
             </w:r>
           </w:p>
         </w:tc>

</xml_diff>

<commit_message>
ENT-3.1 : trame élève relue et déclarée, corrigé mis à jour
Co-Authored-By: Claude Opus 5.5 <noreply@anthropic.com>
</commit_message>
<xml_diff>
--- a/contenus/trames/ENT-3.1-boost-tournee-trame-eleve.docx
+++ b/contenus/trames/ENT-3.1-boost-tournee-trame-eleve.docx
@@ -344,7 +344,51 @@
               <w:rPr>
                 <w:sz w:val="20"/>
               </w:rPr>
-              <w:t>six points, qui donnent une note sur 20 : clients bien situés (case ET quartier), commandes chargées et laissées à quai, charge du vélo-cargo, arrivée avant le train, deux résultats reportés, formules. Tes réponses écrites ici ne sont pas notées par le logiciel : elles servent à réfléchir.</w:t>
+              <w:t>six points, qui donnent une note sur 20 : clients bien situés (case ET quartier), commandes chargées, charge du vélo-cargo, arrivée avant le train, deux résultats reportés, formules. Tes réponses écrites ici ne sont pas notées par le logiciel : elles servent à réfléchir.</w:t>
+            </w:r>
+          </w:p>
+        </w:tc>
+      </w:tr>
+    </w:tbl>
+    <w:p>
+      <w:pPr>
+        <w:keepNext/>
+        <w:spacing w:after="40"/>
+      </w:pPr>
+    </w:p>
+    <w:tbl>
+      <w:tblPr>
+        <w:tblStyle w:val="TableGrid"/>
+        <w:tblW w:type="auto" w:w="0"/>
+        <w:jc w:val="left"/>
+        <w:tblLook w:firstColumn="1" w:firstRow="1" w:lastColumn="0" w:lastRow="0" w:noHBand="0" w:noVBand="1" w:val="04A0"/>
+      </w:tblPr>
+      <w:tblGrid>
+        <w:gridCol w:w="10086"/>
+      </w:tblGrid>
+      <w:tr>
+        <w:tc>
+          <w:tcPr>
+            <w:tcW w:type="dxa" w:w="10086"/>
+            <w:shd w:fill="F2F2F2"/>
+          </w:tcPr>
+          <w:p>
+            <w:pPr>
+              <w:spacing w:after="0"/>
+            </w:pPr>
+            <w:r>
+              <w:rPr>
+                <w:b/>
+                <w:color w:val="111111"/>
+                <w:sz w:val="20"/>
+              </w:rPr>
+              <w:t xml:space="preserve">Ce qui est vrai, ce qui est inventé : </w:t>
+            </w:r>
+            <w:r>
+              <w:rPr>
+                <w:sz w:val="20"/>
+              </w:rPr>
+              <w:t>Boost, son adresse, ses clients de marque (Marou, Molleni, Jacker), le vélo-cargo et le train sont réels. Les sept commerces à livrer, leurs colis, les poids, les horaires et la charge du vélo sont inventés pour l'exercice. Les rues, elles, sont de vraies rues de Nîmes.</w:t>
             </w:r>
           </w:p>
         </w:tc>
@@ -1333,7 +1377,6 @@
     </w:tbl>
     <w:p>
       <w:pPr>
-        <w:keepNext/>
         <w:spacing w:after="0" w:line="60" w:lineRule="exact"/>
       </w:pPr>
       <w:r>
@@ -1342,44 +1385,111 @@
         </w:rPr>
       </w:r>
     </w:p>
+    <w:p>
+      <w:pPr>
+        <w:keepNext/>
+        <w:spacing w:before="160" w:after="80"/>
+      </w:pPr>
+      <w:r>
+        <w:rPr>
+          <w:b/>
+          <w:color w:val="111111"/>
+          <w:sz w:val="23"/>
+        </w:rPr>
+        <w:t>Pour réfléchir</w:t>
+      </w:r>
+      <w:r>
+        <w:rPr>
+          <w:color w:val="595959"/>
+          <w:sz w:val="19"/>
+        </w:rPr>
+        <w:t xml:space="preserve">   Il n'y a pas une seule bonne réponse : explique la tienne, avec tes mots.</w:t>
+      </w:r>
+    </w:p>
     <w:tbl>
       <w:tblPr>
         <w:tblStyle w:val="TableGrid"/>
         <w:tblW w:type="auto" w:w="0"/>
-        <w:jc w:val="left"/>
         <w:tblLook w:firstColumn="1" w:firstRow="1" w:lastColumn="0" w:lastRow="0" w:noHBand="0" w:noVBand="1" w:val="04A0"/>
       </w:tblPr>
       <w:tblGrid>
         <w:gridCol w:w="10086"/>
       </w:tblGrid>
       <w:tr>
+        <w:trPr>
+          <w:cantSplit/>
+          <w:trHeight w:val="2438"/>
+        </w:trPr>
         <w:tc>
           <w:tcPr>
             <w:tcW w:type="dxa" w:w="10086"/>
-            <w:shd w:fill="F2F2F2"/>
+            <w:shd w:fill="FAFAFA"/>
           </w:tcPr>
           <w:p>
             <w:pPr>
-              <w:spacing w:after="0"/>
+              <w:spacing w:after="80"/>
             </w:pPr>
             <w:r>
               <w:rPr>
                 <w:b/>
-                <w:color w:val="111111"/>
-                <w:sz w:val="20"/>
+                <w:sz w:val="21"/>
               </w:rPr>
-              <w:t xml:space="preserve">Ce qui est vrai, ce qui est inventé : </w:t>
+              <w:t>Boost livre des colis en vélo-cargo puis en train plutôt qu'en camion. Dans quelle situation ce choix serait-il moins bon pour l'un de ses clients ?</w:t>
             </w:r>
+          </w:p>
+          <w:p>
+            <w:pPr>
+              <w:spacing w:before="0" w:after="80"/>
+            </w:pPr>
             <w:r>
               <w:rPr>
-                <w:sz w:val="20"/>
+                <w:sz w:val="22"/>
               </w:rPr>
-              <w:t>Boost, son adresse, ses clients de marque (Marou, Molleni, Jacker), le vélo-cargo et le train sont réels. Les sept commerces à livrer, leurs colis, les poids, les horaires et la charge du vélo sont inventés pour l'exercice. Les rues, elles, sont de vraies rues de Nîmes.</w:t>
+            </w:r>
+          </w:p>
+          <w:p>
+            <w:pPr>
+              <w:spacing w:before="0" w:after="80"/>
+            </w:pPr>
+            <w:r>
+              <w:rPr>
+                <w:sz w:val="22"/>
+              </w:rPr>
+            </w:r>
+          </w:p>
+          <w:p>
+            <w:pPr>
+              <w:spacing w:before="0" w:after="80"/>
+            </w:pPr>
+            <w:r>
+              <w:rPr>
+                <w:sz w:val="22"/>
+              </w:rPr>
+            </w:r>
+          </w:p>
+          <w:p>
+            <w:pPr>
+              <w:spacing w:before="0" w:after="80"/>
+            </w:pPr>
+            <w:r>
+              <w:rPr>
+                <w:sz w:val="22"/>
+              </w:rPr>
             </w:r>
           </w:p>
         </w:tc>
       </w:tr>
     </w:tbl>
+    <w:p>
+      <w:pPr>
+        <w:spacing w:after="0" w:line="60" w:lineRule="exact"/>
+      </w:pPr>
+      <w:r>
+        <w:rPr>
+          <w:sz w:val="10"/>
+        </w:rPr>
+      </w:r>
+    </w:p>
     <w:p>
       <w:pPr>
         <w:keepNext/>
@@ -1770,70 +1880,6 @@
                 <w:sz w:val="21"/>
               </w:rPr>
               <w:t>M. Morin demande de situer les clients sur un plan AVANT de construire la tournée. Pourquoi, à ton avis ?</w:t>
-            </w:r>
-          </w:p>
-          <w:p>
-            <w:pPr>
-              <w:spacing w:before="0" w:after="80"/>
-            </w:pPr>
-            <w:r>
-              <w:rPr>
-                <w:sz w:val="22"/>
-              </w:rPr>
-            </w:r>
-          </w:p>
-          <w:p>
-            <w:pPr>
-              <w:spacing w:before="0" w:after="80"/>
-            </w:pPr>
-            <w:r>
-              <w:rPr>
-                <w:sz w:val="22"/>
-              </w:rPr>
-            </w:r>
-          </w:p>
-          <w:p>
-            <w:pPr>
-              <w:spacing w:before="0" w:after="80"/>
-            </w:pPr>
-            <w:r>
-              <w:rPr>
-                <w:sz w:val="22"/>
-              </w:rPr>
-            </w:r>
-          </w:p>
-          <w:p>
-            <w:pPr>
-              <w:spacing w:before="0" w:after="80"/>
-            </w:pPr>
-            <w:r>
-              <w:rPr>
-                <w:sz w:val="22"/>
-              </w:rPr>
-            </w:r>
-          </w:p>
-        </w:tc>
-      </w:tr>
-      <w:tr>
-        <w:trPr>
-          <w:cantSplit/>
-          <w:trHeight w:val="2438"/>
-        </w:trPr>
-        <w:tc>
-          <w:tcPr>
-            <w:tcW w:type="dxa" w:w="10086"/>
-            <w:shd w:fill="FAFAFA"/>
-          </w:tcPr>
-          <w:p>
-            <w:pPr>
-              <w:spacing w:after="80"/>
-            </w:pPr>
-            <w:r>
-              <w:rPr>
-                <w:b/>
-                <w:sz w:val="21"/>
-              </w:rPr>
-              <w:t>Un colis qui rate le train est livré un jour plus tard. Quelle conséquence cela a-t-il pour le client ?</w:t>
             </w:r>
           </w:p>
           <w:p>
@@ -2493,7 +2539,7 @@
               <w:rPr>
                 <w:sz w:val="20"/>
               </w:rPr>
-              <w:t>le menu des quartiers propose douze noms pour sept clients : cinq ne sont à personne, donc tu ne peux pas finir par élimination. Si tu hésites entre deux cases, choisis celle où se trouve le centre du point : le logiciel accepte une seule case fausse.</w:t>
+              <w:t>le menu des quartiers propose douze noms pour sept clients : cinq ne sont à personne, donc tu ne peux pas finir par élimination. Si tu hésites entre deux cases, choisis celle où se trouve le centre du point.</w:t>
             </w:r>
           </w:p>
         </w:tc>
@@ -2530,6 +2576,9 @@
         <w:gridCol w:w="10086"/>
       </w:tblGrid>
       <w:tr>
+        <w:trPr>
+          <w:cantSplit/>
+        </w:trPr>
         <w:tc>
           <w:tcPr>
             <w:tcW w:type="dxa" w:w="10086"/>
@@ -2537,7 +2586,8 @@
           </w:tcPr>
           <w:p>
             <w:pPr>
-              <w:spacing w:after="0"/>
+              <w:keepNext/>
+              <w:spacing w:after="40"/>
             </w:pPr>
             <w:r>
               <w:rPr>
@@ -2545,13 +2595,58 @@
                 <w:color w:val="111111"/>
                 <w:sz w:val="20"/>
               </w:rPr>
-              <w:t xml:space="preserve">Ce que tu dois voir : </w:t>
+              <w:t>Ce que tu dois voir :</w:t>
             </w:r>
+          </w:p>
+          <w:p>
+            <w:pPr>
+              <w:keepNext/>
+              <w:spacing w:before="0" w:after="40"/>
+              <w:ind w:left="397" w:hanging="227"/>
+            </w:pPr>
             <w:r>
               <w:rPr>
                 <w:sz w:val="20"/>
               </w:rPr>
-              <w:t>un champ qui devient rouge quand la case ou le quartier est faux ; le message « Repérage validé » quand tout est bon ; les sept noms de clients qui s'écrivent dans le tableau ; et une nouvelle entrée dans le menu de gauche, « Tournée du 14 avril ». Le logiciel accepte une erreur, mais le point du suivi n'est donné que si les sept clients sont justes. Après trois essais ratés, un bouton « Je ne trouve pas, continuer quand même » apparaît : tu peux avancer, mais ton suivi le montre. Le « Mode hors connexion » (en haut) remplit les quartiers à ta place, sans les cases ; son usage est lui aussi noté dans le suivi.</w:t>
+              <w:t>•  un champ qui devient rouge quand la case ou le quartier est faux ;</w:t>
+            </w:r>
+          </w:p>
+          <w:p>
+            <w:pPr>
+              <w:keepNext/>
+              <w:spacing w:before="0" w:after="40"/>
+              <w:ind w:left="397" w:hanging="227"/>
+            </w:pPr>
+            <w:r>
+              <w:rPr>
+                <w:sz w:val="20"/>
+              </w:rPr>
+              <w:t>•  les sept noms de clients qui s'écrivent dans le tableau quand tout est bon ;</w:t>
+            </w:r>
+          </w:p>
+          <w:p>
+            <w:pPr>
+              <w:keepNext/>
+              <w:spacing w:before="0" w:after="40"/>
+              <w:ind w:left="397" w:hanging="227"/>
+            </w:pPr>
+            <w:r>
+              <w:rPr>
+                <w:sz w:val="20"/>
+              </w:rPr>
+              <w:t>•  le message « Repérage validé » ;</w:t>
+            </w:r>
+          </w:p>
+          <w:p>
+            <w:pPr>
+              <w:spacing w:before="0" w:after="0"/>
+              <w:ind w:left="397" w:hanging="227"/>
+            </w:pPr>
+            <w:r>
+              <w:rPr>
+                <w:sz w:val="20"/>
+              </w:rPr>
+              <w:t>•  une nouvelle entrée dans le menu de gauche : « Tournée du 14 avril ».</w:t>
             </w:r>
           </w:p>
         </w:tc>
@@ -2612,70 +2707,6 @@
                 <w:sz w:val="21"/>
               </w:rPr>
               <w:t>Pour le client le plus difficile à situer, comment as-tu trouvé la case et le quartier ?</w:t>
-            </w:r>
-          </w:p>
-          <w:p>
-            <w:pPr>
-              <w:spacing w:before="0" w:after="80"/>
-            </w:pPr>
-            <w:r>
-              <w:rPr>
-                <w:sz w:val="22"/>
-              </w:rPr>
-            </w:r>
-          </w:p>
-          <w:p>
-            <w:pPr>
-              <w:spacing w:before="0" w:after="80"/>
-            </w:pPr>
-            <w:r>
-              <w:rPr>
-                <w:sz w:val="22"/>
-              </w:rPr>
-            </w:r>
-          </w:p>
-          <w:p>
-            <w:pPr>
-              <w:spacing w:before="0" w:after="80"/>
-            </w:pPr>
-            <w:r>
-              <w:rPr>
-                <w:sz w:val="22"/>
-              </w:rPr>
-            </w:r>
-          </w:p>
-          <w:p>
-            <w:pPr>
-              <w:spacing w:before="0" w:after="80"/>
-            </w:pPr>
-            <w:r>
-              <w:rPr>
-                <w:sz w:val="22"/>
-              </w:rPr>
-            </w:r>
-          </w:p>
-        </w:tc>
-      </w:tr>
-      <w:tr>
-        <w:trPr>
-          <w:cantSplit/>
-          <w:trHeight w:val="2438"/>
-        </w:trPr>
-        <w:tc>
-          <w:tcPr>
-            <w:tcW w:type="dxa" w:w="10086"/>
-            <w:shd w:fill="FAFAFA"/>
-          </w:tcPr>
-          <w:p>
-            <w:pPr>
-              <w:spacing w:after="80"/>
-            </w:pPr>
-            <w:r>
-              <w:rPr>
-                <w:b/>
-                <w:sz w:val="21"/>
-              </w:rPr>
-              <w:t>Un livreur se trompe de quartier. Quelles conséquences cela a-t-il pour Boost ?</w:t>
             </w:r>
           </w:p>
           <w:p>
@@ -2898,8 +2929,101 @@
     </w:tbl>
     <w:p>
       <w:pPr>
+        <w:keepNext/>
         <w:spacing w:after="40"/>
       </w:pPr>
+    </w:p>
+    <w:tbl>
+      <w:tblPr>
+        <w:tblStyle w:val="TableGrid"/>
+        <w:tblW w:type="auto" w:w="0"/>
+        <w:tblLayout w:type="fixed"/>
+        <w:tblLook w:firstColumn="1" w:firstRow="1" w:lastColumn="0" w:lastRow="0" w:noHBand="0" w:noVBand="1" w:val="04A0"/>
+      </w:tblPr>
+      <w:tblGrid>
+        <w:gridCol w:w="5896"/>
+        <w:gridCol w:w="3742"/>
+      </w:tblGrid>
+      <w:tr>
+        <w:tc>
+          <w:tcPr>
+            <w:tcW w:type="dxa" w:w="5896"/>
+            <w:shd w:fill="E8E8E8"/>
+          </w:tcPr>
+          <w:p>
+            <w:pPr>
+              <w:keepNext/>
+              <w:spacing w:after="0"/>
+            </w:pPr>
+            <w:r>
+              <w:rPr>
+                <w:b/>
+                <w:color w:val="111111"/>
+                <w:sz w:val="20"/>
+              </w:rPr>
+              <w:t>Question</w:t>
+            </w:r>
+          </w:p>
+        </w:tc>
+        <w:tc>
+          <w:tcPr>
+            <w:tcW w:type="dxa" w:w="3742"/>
+            <w:shd w:fill="E8E8E8"/>
+          </w:tcPr>
+          <w:p>
+            <w:pPr>
+              <w:keepNext/>
+              <w:spacing w:after="0"/>
+            </w:pPr>
+            <w:r>
+              <w:rPr>
+                <w:b/>
+                <w:color w:val="111111"/>
+                <w:sz w:val="20"/>
+              </w:rPr>
+              <w:t>Ta réponse</w:t>
+            </w:r>
+          </w:p>
+        </w:tc>
+      </w:tr>
+      <w:tr>
+        <w:trPr>
+          <w:trHeight w:val="510"/>
+          <w:cantSplit/>
+        </w:trPr>
+        <w:tc>
+          <w:tcPr>
+            <w:tcW w:type="dxa" w:w="5896"/>
+          </w:tcPr>
+          <w:p>
+            <w:pPr>
+              <w:spacing w:after="0"/>
+            </w:pPr>
+            <w:r>
+              <w:rPr>
+                <w:sz w:val="20"/>
+              </w:rPr>
+              <w:t>Qu'as-tu vu à l'écran qui t'a fait comprendre que tu ne pouvais pas tout emporter ?</w:t>
+            </w:r>
+          </w:p>
+        </w:tc>
+        <w:tc>
+          <w:tcPr>
+            <w:tcW w:type="dxa" w:w="3742"/>
+          </w:tcPr>
+          <w:p/>
+        </w:tc>
+      </w:tr>
+    </w:tbl>
+    <w:p>
+      <w:pPr>
+        <w:spacing w:after="0" w:line="60" w:lineRule="exact"/>
+      </w:pPr>
+      <w:r>
+        <w:rPr>
+          <w:sz w:val="10"/>
+        </w:rPr>
+      </w:r>
     </w:p>
     <w:p>
       <w:pPr>
@@ -2923,14 +3047,13 @@
         <w:tblLook w:firstColumn="1" w:firstRow="1" w:lastColumn="0" w:lastRow="0" w:noHBand="0" w:noVBand="1" w:val="04A0"/>
       </w:tblPr>
       <w:tblGrid>
-        <w:gridCol w:w="2835"/>
-        <w:gridCol w:w="2041"/>
-        <w:gridCol w:w="4762"/>
+        <w:gridCol w:w="4535"/>
+        <w:gridCol w:w="5102"/>
       </w:tblGrid>
       <w:tr>
         <w:tc>
           <w:tcPr>
-            <w:tcW w:type="dxa" w:w="2835"/>
+            <w:tcW w:type="dxa" w:w="4535"/>
             <w:shd w:fill="E8E8E8"/>
           </w:tcPr>
           <w:p>
@@ -2950,7 +3073,7 @@
         </w:tc>
         <w:tc>
           <w:tcPr>
-            <w:tcW w:type="dxa" w:w="2041"/>
+            <w:tcW w:type="dxa" w:w="5102"/>
             <w:shd w:fill="E8E8E8"/>
           </w:tcPr>
           <w:p>
@@ -2968,26 +3091,6 @@
             </w:r>
           </w:p>
         </w:tc>
-        <w:tc>
-          <w:tcPr>
-            <w:tcW w:type="dxa" w:w="4762"/>
-            <w:shd w:fill="E8E8E8"/>
-          </w:tcPr>
-          <w:p>
-            <w:pPr>
-              <w:keepNext/>
-              <w:spacing w:after="0"/>
-            </w:pPr>
-            <w:r>
-              <w:rPr>
-                <w:b/>
-                <w:color w:val="111111"/>
-                <w:sz w:val="20"/>
-              </w:rPr>
-              <w:t>Ce qui m'a fait choisir</w:t>
-            </w:r>
-          </w:p>
-        </w:tc>
       </w:tr>
       <w:tr>
         <w:trPr>
@@ -2995,7 +3098,7 @@
         </w:trPr>
         <w:tc>
           <w:tcPr>
-            <w:tcW w:type="dxa" w:w="2835"/>
+            <w:tcW w:type="dxa" w:w="4535"/>
           </w:tcPr>
           <w:p>
             <w:pPr>
@@ -3011,13 +3114,7 @@
         </w:tc>
         <w:tc>
           <w:tcPr>
-            <w:tcW w:type="dxa" w:w="2041"/>
-          </w:tcPr>
-          <w:p/>
-        </w:tc>
-        <w:tc>
-          <w:tcPr>
-            <w:tcW w:type="dxa" w:w="4762"/>
+            <w:tcW w:type="dxa" w:w="5102"/>
           </w:tcPr>
           <w:p/>
         </w:tc>
@@ -3028,7 +3125,7 @@
         </w:trPr>
         <w:tc>
           <w:tcPr>
-            <w:tcW w:type="dxa" w:w="2835"/>
+            <w:tcW w:type="dxa" w:w="4535"/>
           </w:tcPr>
           <w:p>
             <w:pPr>
@@ -3044,13 +3141,7 @@
         </w:tc>
         <w:tc>
           <w:tcPr>
-            <w:tcW w:type="dxa" w:w="2041"/>
-          </w:tcPr>
-          <w:p/>
-        </w:tc>
-        <w:tc>
-          <w:tcPr>
-            <w:tcW w:type="dxa" w:w="4762"/>
+            <w:tcW w:type="dxa" w:w="5102"/>
           </w:tcPr>
           <w:p/>
         </w:tc>
@@ -3061,7 +3152,7 @@
         </w:trPr>
         <w:tc>
           <w:tcPr>
-            <w:tcW w:type="dxa" w:w="2835"/>
+            <w:tcW w:type="dxa" w:w="4535"/>
           </w:tcPr>
           <w:p>
             <w:pPr>
@@ -3077,13 +3168,7 @@
         </w:tc>
         <w:tc>
           <w:tcPr>
-            <w:tcW w:type="dxa" w:w="2041"/>
-          </w:tcPr>
-          <w:p/>
-        </w:tc>
-        <w:tc>
-          <w:tcPr>
-            <w:tcW w:type="dxa" w:w="4762"/>
+            <w:tcW w:type="dxa" w:w="5102"/>
           </w:tcPr>
           <w:p/>
         </w:tc>
@@ -3094,7 +3179,7 @@
         </w:trPr>
         <w:tc>
           <w:tcPr>
-            <w:tcW w:type="dxa" w:w="2835"/>
+            <w:tcW w:type="dxa" w:w="4535"/>
           </w:tcPr>
           <w:p>
             <w:pPr>
@@ -3110,13 +3195,7 @@
         </w:tc>
         <w:tc>
           <w:tcPr>
-            <w:tcW w:type="dxa" w:w="2041"/>
-          </w:tcPr>
-          <w:p/>
-        </w:tc>
-        <w:tc>
-          <w:tcPr>
-            <w:tcW w:type="dxa" w:w="4762"/>
+            <w:tcW w:type="dxa" w:w="5102"/>
           </w:tcPr>
           <w:p/>
         </w:tc>
@@ -3127,7 +3206,7 @@
         </w:trPr>
         <w:tc>
           <w:tcPr>
-            <w:tcW w:type="dxa" w:w="2835"/>
+            <w:tcW w:type="dxa" w:w="4535"/>
           </w:tcPr>
           <w:p>
             <w:pPr>
@@ -3143,13 +3222,7 @@
         </w:tc>
         <w:tc>
           <w:tcPr>
-            <w:tcW w:type="dxa" w:w="2041"/>
-          </w:tcPr>
-          <w:p/>
-        </w:tc>
-        <w:tc>
-          <w:tcPr>
-            <w:tcW w:type="dxa" w:w="4762"/>
+            <w:tcW w:type="dxa" w:w="5102"/>
           </w:tcPr>
           <w:p/>
         </w:tc>
@@ -3160,7 +3233,7 @@
         </w:trPr>
         <w:tc>
           <w:tcPr>
-            <w:tcW w:type="dxa" w:w="2835"/>
+            <w:tcW w:type="dxa" w:w="4535"/>
           </w:tcPr>
           <w:p>
             <w:pPr>
@@ -3176,13 +3249,7 @@
         </w:tc>
         <w:tc>
           <w:tcPr>
-            <w:tcW w:type="dxa" w:w="2041"/>
-          </w:tcPr>
-          <w:p/>
-        </w:tc>
-        <w:tc>
-          <w:tcPr>
-            <w:tcW w:type="dxa" w:w="4762"/>
+            <w:tcW w:type="dxa" w:w="5102"/>
           </w:tcPr>
           <w:p/>
         </w:tc>
@@ -3193,7 +3260,7 @@
         </w:trPr>
         <w:tc>
           <w:tcPr>
-            <w:tcW w:type="dxa" w:w="2835"/>
+            <w:tcW w:type="dxa" w:w="4535"/>
           </w:tcPr>
           <w:p>
             <w:pPr>
@@ -3209,15 +3276,76 @@
         </w:tc>
         <w:tc>
           <w:tcPr>
-            <w:tcW w:type="dxa" w:w="2041"/>
+            <w:tcW w:type="dxa" w:w="5102"/>
           </w:tcPr>
           <w:p/>
         </w:tc>
+      </w:tr>
+    </w:tbl>
+    <w:p>
+      <w:pPr>
+        <w:keepNext/>
+        <w:spacing w:after="40"/>
+      </w:pPr>
+    </w:p>
+    <w:tbl>
+      <w:tblPr>
+        <w:tblStyle w:val="TableGrid"/>
+        <w:tblW w:type="auto" w:w="0"/>
+        <w:jc w:val="left"/>
+        <w:tblLook w:firstColumn="1" w:firstRow="1" w:lastColumn="0" w:lastRow="0" w:noHBand="0" w:noVBand="1" w:val="04A0"/>
+      </w:tblPr>
+      <w:tblGrid>
+        <w:gridCol w:w="10086"/>
+      </w:tblGrid>
+      <w:tr>
+        <w:trPr>
+          <w:cantSplit/>
+        </w:trPr>
         <w:tc>
           <w:tcPr>
-            <w:tcW w:type="dxa" w:w="4762"/>
+            <w:tcW w:type="dxa" w:w="10086"/>
+            <w:shd w:fill="F2F2F2"/>
           </w:tcPr>
-          <w:p/>
+          <w:p>
+            <w:pPr>
+              <w:keepNext/>
+              <w:spacing w:after="40"/>
+            </w:pPr>
+            <w:r>
+              <w:rPr>
+                <w:b/>
+                <w:color w:val="111111"/>
+                <w:sz w:val="20"/>
+              </w:rPr>
+              <w:t>Tu peux passer à l'étape 5 quand :</w:t>
+            </w:r>
+          </w:p>
+          <w:p>
+            <w:pPr>
+              <w:keepNext/>
+              <w:spacing w:before="0" w:after="40"/>
+              <w:ind w:left="397" w:hanging="227"/>
+            </w:pPr>
+            <w:r>
+              <w:rPr>
+                <w:sz w:val="20"/>
+              </w:rPr>
+              <w:t>•  la jauge ne t'avertit plus ;</w:t>
+            </w:r>
+          </w:p>
+          <w:p>
+            <w:pPr>
+              <w:spacing w:before="0" w:after="0"/>
+              <w:ind w:left="397" w:hanging="227"/>
+            </w:pPr>
+            <w:r>
+              <w:rPr>
+                <w:sz w:val="20"/>
+              </w:rPr>
+              <w:t>•  chaque commande est soit dans le vélo-cargo, soit dans « Commandes restées à quai ».</w:t>
+            </w:r>
+          </w:p>
         </w:tc>
       </w:tr>
     </w:tbl>
@@ -3256,70 +3384,6 @@
       <w:tblGrid>
         <w:gridCol w:w="10086"/>
       </w:tblGrid>
-      <w:tr>
-        <w:trPr>
-          <w:cantSplit/>
-          <w:trHeight w:val="2438"/>
-        </w:trPr>
-        <w:tc>
-          <w:tcPr>
-            <w:tcW w:type="dxa" w:w="10086"/>
-            <w:shd w:fill="FAFAFA"/>
-          </w:tcPr>
-          <w:p>
-            <w:pPr>
-              <w:spacing w:after="80"/>
-            </w:pPr>
-            <w:r>
-              <w:rPr>
-                <w:b/>
-                <w:sz w:val="21"/>
-              </w:rPr>
-              <w:t>Qu'as-tu vu à l'écran qui t'a fait comprendre que tu ne pouvais pas tout emporter ?</w:t>
-            </w:r>
-          </w:p>
-          <w:p>
-            <w:pPr>
-              <w:spacing w:before="0" w:after="80"/>
-            </w:pPr>
-            <w:r>
-              <w:rPr>
-                <w:sz w:val="22"/>
-              </w:rPr>
-            </w:r>
-          </w:p>
-          <w:p>
-            <w:pPr>
-              <w:spacing w:before="0" w:after="80"/>
-            </w:pPr>
-            <w:r>
-              <w:rPr>
-                <w:sz w:val="22"/>
-              </w:rPr>
-            </w:r>
-          </w:p>
-          <w:p>
-            <w:pPr>
-              <w:spacing w:before="0" w:after="80"/>
-            </w:pPr>
-            <w:r>
-              <w:rPr>
-                <w:sz w:val="22"/>
-              </w:rPr>
-            </w:r>
-          </w:p>
-          <w:p>
-            <w:pPr>
-              <w:spacing w:before="0" w:after="80"/>
-            </w:pPr>
-            <w:r>
-              <w:rPr>
-                <w:sz w:val="22"/>
-              </w:rPr>
-            </w:r>
-          </w:p>
-        </w:tc>
-      </w:tr>
       <w:tr>
         <w:trPr>
           <w:cantSplit/>
@@ -4030,6 +4094,50 @@
                 <w:color w:val="111111"/>
                 <w:sz w:val="20"/>
               </w:rPr>
+              <w:t xml:space="preserve">Deux mots à connaître : </w:t>
+            </w:r>
+            <w:r>
+              <w:rPr>
+                <w:sz w:val="20"/>
+              </w:rPr>
+              <w:t>SOMME : une fonction qui additionne plusieurs cases d'un coup. Cellule : une case de la feuille de calcul, repérée par une lettre et un chiffre (comme B2).</w:t>
+            </w:r>
+          </w:p>
+        </w:tc>
+      </w:tr>
+    </w:tbl>
+    <w:p>
+      <w:pPr>
+        <w:keepNext/>
+        <w:spacing w:after="40"/>
+      </w:pPr>
+    </w:p>
+    <w:tbl>
+      <w:tblPr>
+        <w:tblStyle w:val="TableGrid"/>
+        <w:tblW w:type="auto" w:w="0"/>
+        <w:jc w:val="left"/>
+        <w:tblLook w:firstColumn="1" w:firstRow="1" w:lastColumn="0" w:lastRow="0" w:noHBand="0" w:noVBand="1" w:val="04A0"/>
+      </w:tblPr>
+      <w:tblGrid>
+        <w:gridCol w:w="10086"/>
+      </w:tblGrid>
+      <w:tr>
+        <w:tc>
+          <w:tcPr>
+            <w:tcW w:type="dxa" w:w="10086"/>
+            <w:shd w:fill="F2F2F2"/>
+          </w:tcPr>
+          <w:p>
+            <w:pPr>
+              <w:spacing w:after="0"/>
+            </w:pPr>
+            <w:r>
+              <w:rPr>
+                <w:b/>
+                <w:color w:val="111111"/>
+                <w:sz w:val="20"/>
+              </w:rPr>
               <w:t xml:space="preserve">Les couleurs : </w:t>
             </w:r>
             <w:r>
@@ -4065,7 +4173,7 @@
         <w:rPr>
           <w:sz w:val="22"/>
         </w:rPr>
-        <w:t>Poids total chargé : écris une formule avec SOMME qui additionne les poids de tes arrêts. Au lieu de taper les adresses, clique sur la première cellule des poids puis fais glisser la souris jusqu'à la dernière (ou Maj + clic).</w:t>
+        <w:t>Poids total chargé : écris une formule avec SOMME qui additionne les poids de tes arrêts. Au lieu de taper le nom des cellules (comme B2), clique sur la première cellule des poids puis fais glisser la souris jusqu'à la dernière (ou Maj + clic).</w:t>
       </w:r>
     </w:p>
     <w:p>
@@ -4226,7 +4334,87 @@
               <w:rPr>
                 <w:sz w:val="20"/>
               </w:rPr>
-              <w:t>le logiciel compte les heures en minutes depuis minuit : 14 h 00, c'est 14 × 60 = 840 minutes. C'est ce qui te permet d'ajouter une heure et des minutes. Ne tape pas « 14 » tout seul : écris 14:00 ou 14h00. Un exemple pour comprendre l'étape 1 : 6 km à 12 km/h, c'est 6 ÷ 12 = 0,5 h.</w:t>
+              <w:t>le logiciel compte les heures en minutes depuis minuit : 14 h 00, c'est 14 × 60 = 840 minutes. C'est ce qui te permet d'ajouter une heure et des minutes. Ne tape pas « 14 » tout seul : écris 14:00 ou 14h00.</w:t>
+            </w:r>
+          </w:p>
+        </w:tc>
+      </w:tr>
+    </w:tbl>
+    <w:p>
+      <w:pPr>
+        <w:keepNext/>
+        <w:spacing w:after="40"/>
+      </w:pPr>
+    </w:p>
+    <w:tbl>
+      <w:tblPr>
+        <w:tblStyle w:val="TableGrid"/>
+        <w:tblW w:type="auto" w:w="0"/>
+        <w:jc w:val="left"/>
+        <w:tblLook w:firstColumn="1" w:firstRow="1" w:lastColumn="0" w:lastRow="0" w:noHBand="0" w:noVBand="1" w:val="04A0"/>
+      </w:tblPr>
+      <w:tblGrid>
+        <w:gridCol w:w="10086"/>
+      </w:tblGrid>
+      <w:tr>
+        <w:trPr>
+          <w:cantSplit/>
+        </w:trPr>
+        <w:tc>
+          <w:tcPr>
+            <w:tcW w:type="dxa" w:w="10086"/>
+            <w:shd w:fill="F2F2F2"/>
+          </w:tcPr>
+          <w:p>
+            <w:pPr>
+              <w:keepNext/>
+              <w:spacing w:after="40"/>
+            </w:pPr>
+            <w:r>
+              <w:rPr>
+                <w:b/>
+                <w:color w:val="111111"/>
+                <w:sz w:val="20"/>
+              </w:rPr>
+              <w:t>Trois exemples, avec d'autres chiffres que ceux de ta tournée :</w:t>
+            </w:r>
+          </w:p>
+          <w:p>
+            <w:pPr>
+              <w:keepNext/>
+              <w:spacing w:before="0" w:after="40"/>
+              <w:ind w:left="397" w:hanging="227"/>
+            </w:pPr>
+            <w:r>
+              <w:rPr>
+                <w:sz w:val="20"/>
+              </w:rPr>
+              <w:t>•  étape 1 : 6 km à 12 km/h, c'est 6 ÷ 12 = 0,5 h ;</w:t>
+            </w:r>
+          </w:p>
+          <w:p>
+            <w:pPr>
+              <w:keepNext/>
+              <w:spacing w:before="0" w:after="40"/>
+              <w:ind w:left="397" w:hanging="227"/>
+            </w:pPr>
+            <w:r>
+              <w:rPr>
+                <w:sz w:val="20"/>
+              </w:rPr>
+              <w:t>•  étape 2 : 0,5 h, c'est 0,5 × 60 = 30 min ;</w:t>
+            </w:r>
+          </w:p>
+          <w:p>
+            <w:pPr>
+              <w:spacing w:before="0" w:after="0"/>
+              <w:ind w:left="397" w:hanging="227"/>
+            </w:pPr>
+            <w:r>
+              <w:rPr>
+                <w:sz w:val="20"/>
+              </w:rPr>
+              <w:t>•  étape 3 : 4 arrêts de 5 min, c'est 4 × 5 = 20 min.</w:t>
             </w:r>
           </w:p>
         </w:tc>
@@ -4558,6 +4746,9 @@
         <w:gridCol w:w="10086"/>
       </w:tblGrid>
       <w:tr>
+        <w:trPr>
+          <w:cantSplit/>
+        </w:trPr>
         <w:tc>
           <w:tcPr>
             <w:tcW w:type="dxa" w:w="10086"/>
@@ -4565,8 +4756,9 @@
           </w:tcPr>
           <w:p>
             <w:pPr>
+              <w:keepNext/>
               <w:pageBreakBefore/>
-              <w:spacing w:after="0"/>
+              <w:spacing w:after="40"/>
             </w:pPr>
             <w:r>
               <w:rPr>
@@ -4574,13 +4766,45 @@
                 <w:color w:val="111111"/>
                 <w:sz w:val="20"/>
               </w:rPr>
-              <w:t xml:space="preserve">Ce que tu dois voir : </w:t>
+              <w:t>Ce que tu dois voir :</w:t>
             </w:r>
+          </w:p>
+          <w:p>
+            <w:pPr>
+              <w:keepNext/>
+              <w:spacing w:before="0" w:after="40"/>
+              <w:ind w:left="397" w:hanging="227"/>
+            </w:pPr>
             <w:r>
               <w:rPr>
                 <w:sz w:val="20"/>
               </w:rPr>
-              <w:t>après « Vérifier », les cellules justes passent au vert avec « juste ». Si toutes tes formules sont justes mais qu'une contrainte est franchie, la contrainte passe en rouge et le logiciel écrit : « Le calcul est bon : c'est la tournée qu'il faut revoir. » Il ne te dit pas de combien : tu le lis toi-même en comparant tes résultats aux contraintes.</w:t>
+              <w:t>•  après « Vérifier », les cellules justes passent au vert avec « juste » ;</w:t>
+            </w:r>
+          </w:p>
+          <w:p>
+            <w:pPr>
+              <w:keepNext/>
+              <w:spacing w:before="0" w:after="40"/>
+              <w:ind w:left="397" w:hanging="227"/>
+            </w:pPr>
+            <w:r>
+              <w:rPr>
+                <w:sz w:val="20"/>
+              </w:rPr>
+              <w:t>•  si toutes tes formules sont justes mais qu'une contrainte est franchie, la contrainte passe en rouge et le logiciel écrit : « Le calcul est bon : c'est la tournée qu'il faut revoir. » ;</w:t>
+            </w:r>
+          </w:p>
+          <w:p>
+            <w:pPr>
+              <w:spacing w:before="0" w:after="0"/>
+              <w:ind w:left="397" w:hanging="227"/>
+            </w:pPr>
+            <w:r>
+              <w:rPr>
+                <w:sz w:val="20"/>
+              </w:rPr>
+              <w:t>•  il ne te dit pas de combien : tu le lis toi-même en comparant tes résultats aux contraintes.</w:t>
             </w:r>
           </w:p>
         </w:tc>
@@ -4774,7 +4998,7 @@
                 <w:b/>
                 <w:sz w:val="21"/>
               </w:rPr>
-              <w:t>Si une contrainte est franchie alors que tes formules sont justes, que dois-tu changer : les formules ou la tournée ? Explique.</w:t>
+              <w:t>Tes formules sont justes, mais une contrainte est franchie. Comment as-tu su que c'était ta tournée qu'il fallait revoir, et pas tes formules ?</w:t>
             </w:r>
           </w:p>
           <w:p>
@@ -5428,6 +5652,9 @@
         <w:gridCol w:w="10086"/>
       </w:tblGrid>
       <w:tr>
+        <w:trPr>
+          <w:cantSplit/>
+        </w:trPr>
         <w:tc>
           <w:tcPr>
             <w:tcW w:type="dxa" w:w="10086"/>
@@ -5435,7 +5662,8 @@
           </w:tcPr>
           <w:p>
             <w:pPr>
-              <w:spacing w:after="0"/>
+              <w:keepNext/>
+              <w:spacing w:after="40"/>
             </w:pPr>
             <w:r>
               <w:rPr>
@@ -5443,13 +5671,45 @@
                 <w:color w:val="111111"/>
                 <w:sz w:val="20"/>
               </w:rPr>
-              <w:t xml:space="preserve">Ce que tu dois voir : </w:t>
+              <w:t>Ce que tu dois voir :</w:t>
             </w:r>
+          </w:p>
+          <w:p>
+            <w:pPr>
+              <w:keepNext/>
+              <w:spacing w:before="0" w:after="40"/>
+              <w:ind w:left="397" w:hanging="227"/>
+            </w:pPr>
             <w:r>
               <w:rPr>
                 <w:sz w:val="20"/>
               </w:rPr>
-              <w:t>chaque case dit seulement si ta réponse est juste, pas la bonne valeur. Le logiciel refuse de valider tant que ta tournée ne tient pas : il faut que la charge soit respectée, que le train soit tenu et que le départ et l'arrivée soient posés. Si on te refuse, retourne à la carte : c'est la tournée qui est à revoir, pas tes cases.</w:t>
+              <w:t>•  chaque case dit seulement si ta réponse est juste, pas la bonne valeur ;</w:t>
+            </w:r>
+          </w:p>
+          <w:p>
+            <w:pPr>
+              <w:keepNext/>
+              <w:spacing w:before="0" w:after="40"/>
+              <w:ind w:left="397" w:hanging="227"/>
+            </w:pPr>
+            <w:r>
+              <w:rPr>
+                <w:sz w:val="20"/>
+              </w:rPr>
+              <w:t>•  le logiciel refuse de valider tant que ta tournée ne tient pas : il faut que la charge soit respectée, que le train soit tenu et que le départ et l'arrivée soient posés ;</w:t>
+            </w:r>
+          </w:p>
+          <w:p>
+            <w:pPr>
+              <w:spacing w:before="0" w:after="0"/>
+              <w:ind w:left="397" w:hanging="227"/>
+            </w:pPr>
+            <w:r>
+              <w:rPr>
+                <w:sz w:val="20"/>
+              </w:rPr>
+              <w:t>•  si on te refuse, retourne à la carte : c'est la tournée qui est à revoir, pas tes cases.</w:t>
             </w:r>
           </w:p>
         </w:tc>

</xml_diff>